<commit_message>
Introduction Theoretical Framework updated
</commit_message>
<xml_diff>
--- a/The British College_CoverSheet.docx
+++ b/The British College_CoverSheet.docx
@@ -4693,6 +4693,131 @@
       </w:r>
       <w:r>
         <w:t xml:space="preserve"> created an urgent need for a secure intelligent digital healthcare system which provides better healthcare services than current methods.</w:t>
+      </w:r>
+    </w:p>
+    <w:p>
+      <w:r>
+        <w:t xml:space="preserve">This project has established its theoretical framework by addressing three major sectors which comprises of Artificial Intelligence for the recommendation of doctors, Blockchain technology for the security of the medical data, Google Maps API for finding nearby healthcare facilities. It is demonstrated in </w:t>
+      </w:r>
+      <w:r>
+        <w:t>recent research</w:t>
+      </w:r>
+      <w:r>
+        <w:t xml:space="preserve"> that the AI recommendation system analyses the symptoms submitted by the patients to suggest the most appropriate medical specialist which has contributed in achieving high levels of accuracy</w:t>
+      </w:r>
+      <w:sdt>
+        <w:sdtPr>
+          <w:id w:val="-96329141"/>
+          <w:citation/>
+        </w:sdtPr>
+        <w:sdtContent>
+          <w:r>
+            <w:fldChar w:fldCharType="begin"/>
+          </w:r>
+          <w:r>
+            <w:instrText xml:space="preserve"> CITATION Has25 \l 1033 </w:instrText>
+          </w:r>
+          <w:r>
+            <w:fldChar w:fldCharType="separate"/>
+          </w:r>
+          <w:r>
+            <w:rPr>
+              <w:noProof/>
+            </w:rPr>
+            <w:t xml:space="preserve"> </w:t>
+          </w:r>
+          <w:r>
+            <w:rPr>
+              <w:noProof/>
+            </w:rPr>
+            <w:t>(Hassan &amp; Elagamy, 2025)</w:t>
+          </w:r>
+          <w:r>
+            <w:fldChar w:fldCharType="end"/>
+          </w:r>
+        </w:sdtContent>
+      </w:sdt>
+      <w:r>
+        <w:t>.</w:t>
+      </w:r>
+      <w:r>
+        <w:t xml:space="preserve"> Blockchain technology is employed to ensure the immutability and </w:t>
+      </w:r>
+      <w:r>
+        <w:t>integrity of</w:t>
+      </w:r>
+      <w:r>
+        <w:t xml:space="preserve"> the prescribed data and doctor verification records by preventing unauthorized access</w:t>
+      </w:r>
+      <w:r>
+        <w:t xml:space="preserve"> </w:t>
+      </w:r>
+      <w:sdt>
+        <w:sdtPr>
+          <w:id w:val="-916551795"/>
+          <w:citation/>
+        </w:sdtPr>
+        <w:sdtContent>
+          <w:r>
+            <w:fldChar w:fldCharType="begin"/>
+          </w:r>
+          <w:r>
+            <w:instrText xml:space="preserve"> CITATION Ham23 \l 1033 </w:instrText>
+          </w:r>
+          <w:r>
+            <w:fldChar w:fldCharType="separate"/>
+          </w:r>
+          <w:r>
+            <w:rPr>
+              <w:noProof/>
+            </w:rPr>
+            <w:t>(Taherdoost, 2023)</w:t>
+          </w:r>
+          <w:r>
+            <w:fldChar w:fldCharType="end"/>
+          </w:r>
+        </w:sdtContent>
+      </w:sdt>
+      <w:r>
+        <w:t>.</w:t>
+      </w:r>
+      <w:r>
+        <w:t xml:space="preserve"> Furthermore, the integration of Google Maps API is enabled to locate nearby hospitals and pharmacies in real time which addresses the geographical barriers making the services easily accessible</w:t>
+      </w:r>
+      <w:sdt>
+        <w:sdtPr>
+          <w:id w:val="541099240"/>
+          <w:citation/>
+        </w:sdtPr>
+        <w:sdtContent>
+          <w:r>
+            <w:fldChar w:fldCharType="begin"/>
+          </w:r>
+          <w:r>
+            <w:instrText xml:space="preserve"> CITATION Aga20 \l 1033 </w:instrText>
+          </w:r>
+          <w:r>
+            <w:fldChar w:fldCharType="separate"/>
+          </w:r>
+          <w:r>
+            <w:rPr>
+              <w:noProof/>
+            </w:rPr>
+            <w:t xml:space="preserve"> </w:t>
+          </w:r>
+          <w:r>
+            <w:rPr>
+              <w:noProof/>
+            </w:rPr>
+            <w:t>(Agarwal &amp; Biswas, 2020)</w:t>
+          </w:r>
+          <w:r>
+            <w:fldChar w:fldCharType="end"/>
+          </w:r>
+        </w:sdtContent>
+      </w:sdt>
+      <w:r>
+        <w:t>.</w:t>
       </w:r>
     </w:p>
     <w:p>
@@ -6230,11 +6355,54 @@
     <b:Year>2024</b:Year>
     <b:RefOrder>5</b:RefOrder>
   </b:Source>
+  <b:Source>
+    <b:Tag>Has25</b:Tag>
+    <b:SourceType>JournalArticle</b:SourceType>
+    <b:Guid>{7984C164-4631-4553-8120-BDB4A1D1EB75}</b:Guid>
+    <b:Author>
+      <b:Author>
+        <b:NameList>
+          <b:Person>
+            <b:Last>Hassan</b:Last>
+            <b:First>Basma</b:First>
+            <b:Middle>M.</b:Middle>
+          </b:Person>
+          <b:Person>
+            <b:Last>Elagamy</b:Last>
+            <b:Middle>Mohamed</b:Middle>
+            <b:First>Shahd  </b:First>
+          </b:Person>
+        </b:NameList>
+      </b:Author>
+    </b:Author>
+    <b:Title>Personalized medical recommendation system with machine learning</b:Title>
+    <b:Year>2025</b:Year>
+    <b:JournalName>Neural Computing and Applications</b:JournalName>
+    <b:RefOrder>6</b:RefOrder>
+  </b:Source>
+  <b:Source>
+    <b:Tag>Ham23</b:Tag>
+    <b:SourceType>JournalArticle</b:SourceType>
+    <b:Guid>{F93246D2-154D-4578-ADD5-FD0C5B203AF7}</b:Guid>
+    <b:Author>
+      <b:Author>
+        <b:NameList>
+          <b:Person>
+            <b:Last>Taherdoost</b:Last>
+            <b:First>Hamed</b:First>
+          </b:Person>
+        </b:NameList>
+      </b:Author>
+    </b:Author>
+    <b:Title>Privacy and Security of Blockchain in Healthcare: Applications, Challenges, and Future Perspectives</b:Title>
+    <b:Year>2023</b:Year>
+    <b:RefOrder>7</b:RefOrder>
+  </b:Source>
 </b:Sources>
 </file>
 
 <file path=customXml/itemProps1.xml><?xml version="1.0" encoding="utf-8"?>
-<ds:datastoreItem xmlns:ds="http://schemas.openxmlformats.org/officeDocument/2006/customXml" ds:itemID="{55B41EEE-3EA6-497F-B86A-8AFD83BEE9B8}">
+<ds:datastoreItem xmlns:ds="http://schemas.openxmlformats.org/officeDocument/2006/customXml" ds:itemID="{A18B6739-4021-4F84-83C4-83C8BD34536C}">
   <ds:schemaRefs>
     <ds:schemaRef ds:uri="http://schemas.openxmlformats.org/officeDocument/2006/bibliography"/>
   </ds:schemaRefs>

</xml_diff>